<commit_message>
FPRIN01-4 NOSE DOCK: parametros de viento de la hoja NTV R2.1 (Po, exposicion C, K, qH)
Co-Authored-By: Claude Opus 5.5 <noreply@anthropic.com>
Claude-Session: https://claude.ai/code/session_01TgbefMDhkrJoczoduHtpb4
</commit_message>
<xml_diff>
--- a/FPRIN01-4_PARAMETROS_NOSE_DOCK_H5_H6.docx
+++ b/FPRIN01-4_PARAMETROS_NOSE_DOCK_H5_H6.docx
@@ -2085,7 +2085,7 @@
                 <w:sz w:val="20"/>
                 <w:szCs w:val="20"/>
               </w:rPr>
-              <w:t xml:space="preserve">Norma</w:t>
+              <w:t xml:space="preserve">Presión básica Po (NTV 2.1, 80 km/h a 10 m)</w:t>
             </w:r>
           </w:p>
         </w:tc>
@@ -2113,7 +2113,7 @@
                 <w:sz w:val="20"/>
                 <w:szCs w:val="20"/>
               </w:rPr>
-              <w:t>NTV-1997</w:t>
+              <w:t>30 kg/m²</w:t>
             </w:r>
           </w:p>
         </w:tc>
@@ -2179,7 +2179,7 @@
                 <w:sz w:val="20"/>
                 <w:szCs w:val="20"/>
               </w:rPr>
-              <w:t>Tipo 1 (NTV 3.1)</w:t>
+              <w:t>Tipo 1 (NTV 3.1), FR = 1.0</w:t>
             </w:r>
           </w:p>
         </w:tc>
@@ -2217,7 +2217,7 @@
                 <w:sz w:val="20"/>
                 <w:szCs w:val="20"/>
               </w:rPr>
-              <w:t>Periodo de retorno</w:t>
+              <w:t>Zona de exposición / factor K (Tabla 4.1)</w:t>
             </w:r>
           </w:p>
         </w:tc>
@@ -2245,7 +2245,7 @@
                 <w:sz w:val="20"/>
                 <w:szCs w:val="20"/>
               </w:rPr>
-              <w:t>50 años</w:t>
+              <w:t>C (aeropuerto) / 1.6</w:t>
             </w:r>
           </w:p>
         </w:tc>
@@ -2283,7 +2283,7 @@
                 <w:sz w:val="20"/>
                 <w:szCs w:val="20"/>
               </w:rPr>
-              <w:t>Presión neta máxima (techo, viento -Z)</w:t>
+              <w:t>Presión dinámica de diseño qH = Cz·K·Po (H = 10.62 m)</w:t>
             </w:r>
           </w:p>
         </w:tc>
@@ -2311,7 +2311,7 @@
                 <w:sz w:val="20"/>
                 <w:szCs w:val="20"/>
               </w:rPr>
-              <w:t xml:space="preserve">70.8 kg/m</w:t>
+              <w:t xml:space="preserve">48.8 kg/m</w:t>
             </w:r>
             <w:r>
               <w:rPr>

</xml_diff>